<commit_message>
glmnet rendered, candles range pending
</commit_message>
<xml_diff>
--- a/outputs/AA-evals/evaluation-scores.docx
+++ b/outputs/AA-evals/evaluation-scores.docx
@@ -187,6 +187,441 @@
                 <w:sz w:val="16"/>
               </w:rPr>
               <w:t>verdict</w:t>
+            </w:r>
+          </w:p>
+        </w:tc>
+      </w:tr>
+      <w:tr>
+        <w:tc>
+          <w:tcPr>
+            <w:tcW w:type="dxa" w:w="785"/>
+          </w:tcPr>
+          <w:p>
+            <w:r>
+              <w:rPr>
+                <w:sz w:val="16"/>
+              </w:rPr>
+              <w:t>2026-06-23</w:t>
+            </w:r>
+          </w:p>
+        </w:tc>
+        <w:tc>
+          <w:tcPr>
+            <w:tcW w:type="dxa" w:w="785"/>
+          </w:tcPr>
+          <w:p>
+            <w:r>
+              <w:rPr>
+                <w:sz w:val="16"/>
+              </w:rPr>
+              <w:t>head-to-head (1h)</w:t>
+            </w:r>
+          </w:p>
+        </w:tc>
+        <w:tc>
+          <w:tcPr>
+            <w:tcW w:type="dxa" w:w="785"/>
+          </w:tcPr>
+          <w:p>
+            <w:r>
+              <w:rPr>
+                <w:sz w:val="16"/>
+              </w:rPr>
+              <w:t>458,539r / 61f (1h all-market)</w:t>
+            </w:r>
+          </w:p>
+        </w:tc>
+        <w:tc>
+          <w:tcPr>
+            <w:tcW w:type="dxa" w:w="785"/>
+          </w:tcPr>
+          <w:p>
+            <w:r>
+              <w:rPr>
+                <w:sz w:val="16"/>
+              </w:rPr>
+              <w:t>LightGBM</w:t>
+            </w:r>
+          </w:p>
+        </w:tc>
+        <w:tc>
+          <w:tcPr>
+            <w:tcW w:type="dxa" w:w="785"/>
+          </w:tcPr>
+          <w:p>
+            <w:r>
+              <w:rPr>
+                <w:sz w:val="16"/>
+              </w:rPr>
+              <w:t>0.510</w:t>
+            </w:r>
+          </w:p>
+        </w:tc>
+        <w:tc>
+          <w:tcPr>
+            <w:tcW w:type="dxa" w:w="785"/>
+          </w:tcPr>
+          <w:p>
+            <w:r>
+              <w:rPr>
+                <w:sz w:val="16"/>
+              </w:rPr>
+              <w:t>0.311</w:t>
+            </w:r>
+          </w:p>
+        </w:tc>
+        <w:tc>
+          <w:tcPr>
+            <w:tcW w:type="dxa" w:w="785"/>
+          </w:tcPr>
+          <w:p>
+            <w:r>
+              <w:rPr>
+                <w:sz w:val="16"/>
+              </w:rPr>
+              <w:t>0.303</w:t>
+            </w:r>
+          </w:p>
+        </w:tc>
+        <w:tc>
+          <w:tcPr>
+            <w:tcW w:type="dxa" w:w="785"/>
+          </w:tcPr>
+          <w:p>
+            <w:r>
+              <w:rPr>
+                <w:sz w:val="16"/>
+              </w:rPr>
+              <w:t>+2.5%</w:t>
+            </w:r>
+          </w:p>
+        </w:tc>
+        <w:tc>
+          <w:tcPr>
+            <w:tcW w:type="dxa" w:w="785"/>
+          </w:tcPr>
+          <w:p>
+            <w:r>
+              <w:rPr>
+                <w:sz w:val="16"/>
+              </w:rPr>
+              <w:t>-0.38%</w:t>
+            </w:r>
+          </w:p>
+        </w:tc>
+        <w:tc>
+          <w:tcPr>
+            <w:tcW w:type="dxa" w:w="785"/>
+          </w:tcPr>
+          <w:p>
+            <w:r>
+              <w:rPr>
+                <w:sz w:val="16"/>
+              </w:rPr>
+              <w:t>7,348</w:t>
+            </w:r>
+          </w:p>
+        </w:tc>
+        <w:tc>
+          <w:tcPr>
+            <w:tcW w:type="dxa" w:w="785"/>
+          </w:tcPr>
+          <w:p>
+            <w:r>
+              <w:rPr>
+                <w:sz w:val="16"/>
+              </w:rPr>
+              <w:t>NO-GO</w:t>
+            </w:r>
+          </w:p>
+        </w:tc>
+      </w:tr>
+      <w:tr>
+        <w:tc>
+          <w:tcPr>
+            <w:tcW w:type="dxa" w:w="785"/>
+          </w:tcPr>
+          <w:p>
+            <w:r>
+              <w:rPr>
+                <w:sz w:val="16"/>
+              </w:rPr>
+              <w:t>2026-06-23</w:t>
+            </w:r>
+          </w:p>
+        </w:tc>
+        <w:tc>
+          <w:tcPr>
+            <w:tcW w:type="dxa" w:w="785"/>
+          </w:tcPr>
+          <w:p>
+            <w:r>
+              <w:rPr>
+                <w:sz w:val="16"/>
+              </w:rPr>
+              <w:t>label sweep</w:t>
+            </w:r>
+          </w:p>
+        </w:tc>
+        <w:tc>
+          <w:tcPr>
+            <w:tcW w:type="dxa" w:w="785"/>
+          </w:tcPr>
+          <w:p>
+            <w:r>
+              <w:rPr>
+                <w:sz w:val="16"/>
+              </w:rPr>
+              <w:t>33,533r / 61f</w:t>
+            </w:r>
+          </w:p>
+        </w:tc>
+        <w:tc>
+          <w:tcPr>
+            <w:tcW w:type="dxa" w:w="785"/>
+          </w:tcPr>
+          <w:p>
+            <w:r>
+              <w:rPr>
+                <w:sz w:val="16"/>
+              </w:rPr>
+              <w:t>best +3.0/-1.5ATR 480b</w:t>
+            </w:r>
+          </w:p>
+        </w:tc>
+        <w:tc>
+          <w:tcPr>
+            <w:tcW w:type="dxa" w:w="785"/>
+          </w:tcPr>
+          <w:p>
+            <w:r>
+              <w:rPr>
+                <w:sz w:val="16"/>
+              </w:rPr>
+              <w:t>LightGBM</w:t>
+            </w:r>
+          </w:p>
+        </w:tc>
+        <w:tc>
+          <w:tcPr>
+            <w:tcW w:type="dxa" w:w="785"/>
+          </w:tcPr>
+          <w:p>
+            <w:r>
+              <w:rPr>
+                <w:sz w:val="16"/>
+              </w:rPr>
+              <w:t>0.516</w:t>
+            </w:r>
+          </w:p>
+        </w:tc>
+        <w:tc>
+          <w:tcPr>
+            <w:tcW w:type="dxa" w:w="785"/>
+          </w:tcPr>
+          <w:p>
+            <w:r>
+              <w:rPr>
+                <w:sz w:val="16"/>
+              </w:rPr>
+              <w:t>0.324</w:t>
+            </w:r>
+          </w:p>
+        </w:tc>
+        <w:tc>
+          <w:tcPr>
+            <w:tcW w:type="dxa" w:w="785"/>
+          </w:tcPr>
+          <w:p>
+            <w:r>
+              <w:rPr>
+                <w:sz w:val="16"/>
+              </w:rPr>
+              <w:t>0.315</w:t>
+            </w:r>
+          </w:p>
+        </w:tc>
+        <w:tc>
+          <w:tcPr>
+            <w:tcW w:type="dxa" w:w="785"/>
+          </w:tcPr>
+          <w:p>
+            <w:r>
+              <w:rPr>
+                <w:sz w:val="16"/>
+              </w:rPr>
+              <w:t>+2.9%</w:t>
+            </w:r>
+          </w:p>
+        </w:tc>
+        <w:tc>
+          <w:tcPr>
+            <w:tcW w:type="dxa" w:w="785"/>
+          </w:tcPr>
+          <w:p>
+            <w:r>
+              <w:rPr>
+                <w:sz w:val="16"/>
+              </w:rPr>
+              <w:t>-0.25%</w:t>
+            </w:r>
+          </w:p>
+        </w:tc>
+        <w:tc>
+          <w:tcPr>
+            <w:tcW w:type="dxa" w:w="785"/>
+          </w:tcPr>
+          <w:p>
+            <w:r>
+              <w:rPr>
+                <w:sz w:val="16"/>
+              </w:rPr>
+              <w:t>5,273</w:t>
+            </w:r>
+          </w:p>
+        </w:tc>
+      </w:tr>
+      <w:tr>
+        <w:tc>
+          <w:tcPr>
+            <w:tcW w:type="dxa" w:w="785"/>
+          </w:tcPr>
+          <w:p>
+            <w:r>
+              <w:rPr>
+                <w:sz w:val="16"/>
+              </w:rPr>
+              <w:t>2026-06-23</w:t>
+            </w:r>
+          </w:p>
+        </w:tc>
+        <w:tc>
+          <w:tcPr>
+            <w:tcW w:type="dxa" w:w="785"/>
+          </w:tcPr>
+          <w:p>
+            <w:r>
+              <w:rPr>
+                <w:sz w:val="16"/>
+              </w:rPr>
+              <w:t>label sweep</w:t>
+            </w:r>
+          </w:p>
+        </w:tc>
+        <w:tc>
+          <w:tcPr>
+            <w:tcW w:type="dxa" w:w="785"/>
+          </w:tcPr>
+          <w:p>
+            <w:r>
+              <w:rPr>
+                <w:sz w:val="16"/>
+              </w:rPr>
+              <w:t>33,356r / 61f</w:t>
+            </w:r>
+          </w:p>
+        </w:tc>
+        <w:tc>
+          <w:tcPr>
+            <w:tcW w:type="dxa" w:w="785"/>
+          </w:tcPr>
+          <w:p>
+            <w:r>
+              <w:rPr>
+                <w:sz w:val="16"/>
+              </w:rPr>
+              <w:t>best +3.0/-2.0ATR 48b</w:t>
+            </w:r>
+          </w:p>
+        </w:tc>
+        <w:tc>
+          <w:tcPr>
+            <w:tcW w:type="dxa" w:w="785"/>
+          </w:tcPr>
+          <w:p>
+            <w:r>
+              <w:rPr>
+                <w:sz w:val="16"/>
+              </w:rPr>
+              <w:t>LightGBM</w:t>
+            </w:r>
+          </w:p>
+        </w:tc>
+        <w:tc>
+          <w:tcPr>
+            <w:tcW w:type="dxa" w:w="785"/>
+          </w:tcPr>
+          <w:p>
+            <w:r>
+              <w:rPr>
+                <w:sz w:val="16"/>
+              </w:rPr>
+              <w:t>0.527</w:t>
+            </w:r>
+          </w:p>
+        </w:tc>
+        <w:tc>
+          <w:tcPr>
+            <w:tcW w:type="dxa" w:w="785"/>
+          </w:tcPr>
+          <w:p>
+            <w:r>
+              <w:rPr>
+                <w:sz w:val="16"/>
+              </w:rPr>
+              <w:t>0.363</w:t>
+            </w:r>
+          </w:p>
+        </w:tc>
+        <w:tc>
+          <w:tcPr>
+            <w:tcW w:type="dxa" w:w="785"/>
+          </w:tcPr>
+          <w:p>
+            <w:r>
+              <w:rPr>
+                <w:sz w:val="16"/>
+              </w:rPr>
+              <w:t>0.331</w:t>
+            </w:r>
+          </w:p>
+        </w:tc>
+        <w:tc>
+          <w:tcPr>
+            <w:tcW w:type="dxa" w:w="785"/>
+          </w:tcPr>
+          <w:p>
+            <w:r>
+              <w:rPr>
+                <w:sz w:val="16"/>
+              </w:rPr>
+              <w:t>+9.5%</w:t>
+            </w:r>
+          </w:p>
+        </w:tc>
+        <w:tc>
+          <w:tcPr>
+            <w:tcW w:type="dxa" w:w="785"/>
+          </w:tcPr>
+          <w:p>
+            <w:r>
+              <w:rPr>
+                <w:sz w:val="16"/>
+              </w:rPr>
+              <w:t>-0.25%</w:t>
+            </w:r>
+          </w:p>
+        </w:tc>
+        <w:tc>
+          <w:tcPr>
+            <w:tcW w:type="dxa" w:w="785"/>
+          </w:tcPr>
+          <w:p>
+            <w:r>
+              <w:rPr>
+                <w:sz w:val="16"/>
+              </w:rPr>
+              <w:t>4,290</w:t>
             </w:r>
           </w:p>
         </w:tc>

</xml_diff>

<commit_message>
README and consolidate 00-notebook completed
</commit_message>
<xml_diff>
--- a/outputs/AA-evals/evaluation-scores.docx
+++ b/outputs/AA-evals/evaluation-scores.docx
@@ -187,6 +187,151 @@
                 <w:sz w:val="16"/>
               </w:rPr>
               <w:t>verdict</w:t>
+            </w:r>
+          </w:p>
+        </w:tc>
+      </w:tr>
+      <w:tr>
+        <w:tc>
+          <w:tcPr>
+            <w:tcW w:type="dxa" w:w="785"/>
+          </w:tcPr>
+          <w:p>
+            <w:r>
+              <w:rPr>
+                <w:sz w:val="16"/>
+              </w:rPr>
+              <w:t>2026-07-01</w:t>
+            </w:r>
+          </w:p>
+        </w:tc>
+        <w:tc>
+          <w:tcPr>
+            <w:tcW w:type="dxa" w:w="785"/>
+          </w:tcPr>
+          <w:p>
+            <w:r>
+              <w:rPr>
+                <w:sz w:val="16"/>
+              </w:rPr>
+              <w:t>head-to-head (1h)</w:t>
+            </w:r>
+          </w:p>
+        </w:tc>
+        <w:tc>
+          <w:tcPr>
+            <w:tcW w:type="dxa" w:w="785"/>
+          </w:tcPr>
+          <w:p>
+            <w:r>
+              <w:rPr>
+                <w:sz w:val="16"/>
+              </w:rPr>
+              <w:t>458,539r / 61f (1h all-market)</w:t>
+            </w:r>
+          </w:p>
+        </w:tc>
+        <w:tc>
+          <w:tcPr>
+            <w:tcW w:type="dxa" w:w="785"/>
+          </w:tcPr>
+          <w:p>
+            <w:r>
+              <w:rPr>
+                <w:sz w:val="16"/>
+              </w:rPr>
+              <w:t>LightGBM</w:t>
+            </w:r>
+          </w:p>
+        </w:tc>
+        <w:tc>
+          <w:tcPr>
+            <w:tcW w:type="dxa" w:w="785"/>
+          </w:tcPr>
+          <w:p>
+            <w:r>
+              <w:rPr>
+                <w:sz w:val="16"/>
+              </w:rPr>
+              <w:t>0.510</w:t>
+            </w:r>
+          </w:p>
+        </w:tc>
+        <w:tc>
+          <w:tcPr>
+            <w:tcW w:type="dxa" w:w="785"/>
+          </w:tcPr>
+          <w:p>
+            <w:r>
+              <w:rPr>
+                <w:sz w:val="16"/>
+              </w:rPr>
+              <w:t>0.311</w:t>
+            </w:r>
+          </w:p>
+        </w:tc>
+        <w:tc>
+          <w:tcPr>
+            <w:tcW w:type="dxa" w:w="785"/>
+          </w:tcPr>
+          <w:p>
+            <w:r>
+              <w:rPr>
+                <w:sz w:val="16"/>
+              </w:rPr>
+              <w:t>0.303</w:t>
+            </w:r>
+          </w:p>
+        </w:tc>
+        <w:tc>
+          <w:tcPr>
+            <w:tcW w:type="dxa" w:w="785"/>
+          </w:tcPr>
+          <w:p>
+            <w:r>
+              <w:rPr>
+                <w:sz w:val="16"/>
+              </w:rPr>
+              <w:t>+2.5%</w:t>
+            </w:r>
+          </w:p>
+        </w:tc>
+        <w:tc>
+          <w:tcPr>
+            <w:tcW w:type="dxa" w:w="785"/>
+          </w:tcPr>
+          <w:p>
+            <w:r>
+              <w:rPr>
+                <w:sz w:val="16"/>
+              </w:rPr>
+              <w:t>-0.38%</w:t>
+            </w:r>
+          </w:p>
+        </w:tc>
+        <w:tc>
+          <w:tcPr>
+            <w:tcW w:type="dxa" w:w="785"/>
+          </w:tcPr>
+          <w:p>
+            <w:r>
+              <w:rPr>
+                <w:sz w:val="16"/>
+              </w:rPr>
+              <w:t>7,348</w:t>
+            </w:r>
+          </w:p>
+        </w:tc>
+        <w:tc>
+          <w:tcPr>
+            <w:tcW w:type="dxa" w:w="785"/>
+          </w:tcPr>
+          <w:p>
+            <w:r>
+              <w:rPr>
+                <w:sz w:val="16"/>
+              </w:rPr>
+              <w:t>NO-GO</w:t>
             </w:r>
           </w:p>
         </w:tc>

</xml_diff>

<commit_message>
eval: 1d label sweep (best +3/-1 ATR 20b, all NO-GO) + swept-label gated matrix (breadth FRAGILE, funding NOT CLEARED); ms build running
</commit_message>
<xml_diff>
--- a/outputs/AA-evals/evaluation-scores.docx
+++ b/outputs/AA-evals/evaluation-scores.docx
@@ -187,6 +187,151 @@
                 <w:sz w:val="16"/>
               </w:rPr>
               <w:t>verdict</w:t>
+            </w:r>
+          </w:p>
+        </w:tc>
+      </w:tr>
+      <w:tr>
+        <w:tc>
+          <w:tcPr>
+            <w:tcW w:type="dxa" w:w="785"/>
+          </w:tcPr>
+          <w:p>
+            <w:r>
+              <w:rPr>
+                <w:sz w:val="16"/>
+              </w:rPr>
+              <w:t>2026-08-17</w:t>
+            </w:r>
+          </w:p>
+        </w:tc>
+        <w:tc>
+          <w:tcPr>
+            <w:tcW w:type="dxa" w:w="785"/>
+          </w:tcPr>
+          <w:p>
+            <w:r>
+              <w:rPr>
+                <w:sz w:val="16"/>
+              </w:rPr>
+              <w:t>label sweep</w:t>
+            </w:r>
+          </w:p>
+        </w:tc>
+        <w:tc>
+          <w:tcPr>
+            <w:tcW w:type="dxa" w:w="785"/>
+          </w:tcPr>
+          <w:p>
+            <w:r>
+              <w:rPr>
+                <w:sz w:val="16"/>
+              </w:rPr>
+              <w:t>2,616r / 57f | best +3.0/-1.0ATR 20b</w:t>
+            </w:r>
+          </w:p>
+        </w:tc>
+        <w:tc>
+          <w:tcPr>
+            <w:tcW w:type="dxa" w:w="785"/>
+          </w:tcPr>
+          <w:p>
+            <w:r>
+              <w:rPr>
+                <w:sz w:val="16"/>
+              </w:rPr>
+              <w:t>LightGBM</w:t>
+            </w:r>
+          </w:p>
+        </w:tc>
+        <w:tc>
+          <w:tcPr>
+            <w:tcW w:type="dxa" w:w="785"/>
+          </w:tcPr>
+          <w:p>
+            <w:r>
+              <w:rPr>
+                <w:sz w:val="16"/>
+              </w:rPr>
+              <w:t>0.551</w:t>
+            </w:r>
+          </w:p>
+        </w:tc>
+        <w:tc>
+          <w:tcPr>
+            <w:tcW w:type="dxa" w:w="785"/>
+          </w:tcPr>
+          <w:p>
+            <w:r>
+              <w:rPr>
+                <w:sz w:val="16"/>
+              </w:rPr>
+              <w:t>0.191</w:t>
+            </w:r>
+          </w:p>
+        </w:tc>
+        <w:tc>
+          <w:tcPr>
+            <w:tcW w:type="dxa" w:w="785"/>
+          </w:tcPr>
+          <w:p>
+            <w:r>
+              <w:rPr>
+                <w:sz w:val="16"/>
+              </w:rPr>
+              <w:t>0.144</w:t>
+            </w:r>
+          </w:p>
+        </w:tc>
+        <w:tc>
+          <w:tcPr>
+            <w:tcW w:type="dxa" w:w="785"/>
+          </w:tcPr>
+          <w:p>
+            <w:r>
+              <w:rPr>
+                <w:sz w:val="16"/>
+              </w:rPr>
+              <w:t>+32.6%</w:t>
+            </w:r>
+          </w:p>
+        </w:tc>
+        <w:tc>
+          <w:tcPr>
+            <w:tcW w:type="dxa" w:w="785"/>
+          </w:tcPr>
+          <w:p>
+            <w:r>
+              <w:rPr>
+                <w:sz w:val="16"/>
+              </w:rPr>
+              <w:t>-0.13%</w:t>
+            </w:r>
+          </w:p>
+        </w:tc>
+        <w:tc>
+          <w:tcPr>
+            <w:tcW w:type="dxa" w:w="785"/>
+          </w:tcPr>
+          <w:p>
+            <w:r>
+              <w:rPr>
+                <w:sz w:val="16"/>
+              </w:rPr>
+              <w:t>383</w:t>
+            </w:r>
+          </w:p>
+        </w:tc>
+        <w:tc>
+          <w:tcPr>
+            <w:tcW w:type="dxa" w:w="785"/>
+          </w:tcPr>
+          <w:p>
+            <w:r>
+              <w:rPr>
+                <w:sz w:val="16"/>
+              </w:rPr>
+              <w:t>NO-GO</w:t>
             </w:r>
           </w:p>
         </w:tc>

</xml_diff>